<commit_message>
Informe: name the course pillars in the body, re-export all figures without the custom curve, trim text to keep 12 pages; web: hide the custom model when it equals a preset
</commit_message>
<xml_diff>
--- a/informe/informe_borrador.docx
+++ b/informe/informe_borrador.docx
@@ -91,7 +91,7 @@
       <w:pPr>
         <w:pStyle w:val="CoverLinks"/>
       </w:pPr>
-      <w:hyperlink r:id="rIdInformeEstilo1xxxxxxxxxxxxxxxxxx" w:history="1">
+      <w:hyperlink r:id="rIdInformeEstilo1" w:history="1">
         <w:r>
           <w:rPr>
             <w:u w:val="single"/>
@@ -104,7 +104,7 @@
       <w:pPr>
         <w:pStyle w:val="CoverLinks"/>
       </w:pPr>
-      <w:hyperlink r:id="rIdInformeEstilo2xxxxxxxxxxxxxxxxxx" w:history="1">
+      <w:hyperlink r:id="rIdInformeEstilo2" w:history="1">
         <w:r>
           <w:rPr>
             <w:u w:val="single"/>
@@ -174,7 +174,7 @@
         <w:rPr>
           <w:lang w:val="es-CL"/>
         </w:rPr>
-        <w:t xml:space="preserve">El trabajo es una web que explora tres escalas de la gravedad: las órbitas del Sistema Solar, donde comprobamos las leyes de Kepler; la rotación de una galaxia; y distintos escenarios de expansión del Universo. En cada caso nos preguntamos qué predice el modelo y qué tan bien se relaciona con lo observado. Como estudiantes de computación, nos interesa traducir estas ideas a instrucciones y hacer visible el razonamiento que hay detrás; la gravedad conecta los tres problemas, aunque cada uno exige un tratamiento distinto.</w:t>
+        <w:t xml:space="preserve">El trabajo es una web que explora tres escalas de la gravedad: las órbitas del Sistema Solar, donde comprobamos las leyes de Kepler; la rotación de una galaxia; y distintos escenarios de expansión del Universo. En cada caso nos preguntamos qué predice el modelo y qué tan bien se relaciona con lo observado. La gravedad conecta los tres problemas, y como estudiantes de computación nos interesa hacer visible el razonamiento que hay detrás.</w:t>
       </w:r>
     </w:p>
     <w:p>
@@ -425,7 +425,7 @@
         <w:rPr>
           <w:lang w:val="es-CL"/>
         </w:rPr>
-        <w:t xml:space="preserve">Cada órbita comienza con un tamaño y una excentricidad, es decir, qué tanto se aparta de un círculo. El programa obtiene la velocidad inicial con la relación vis-viva y revisa si el movimiento respeta lo esperado.</w:t>
+        <w:t xml:space="preserve">Cada órbita parte de un tamaño y una excentricidad, qué tanto se aparta de un círculo; la velocidad inicial sale de la relación vis-viva.</w:t>
       </w:r>
     </w:p>
     <w:p>
@@ -840,7 +840,7 @@
         <w:rPr>
           <w:lang w:val="es-CL"/>
         </w:rPr>
-        <w:t xml:space="preserve"> (chi cuadrado) resume las diferencias entre predicciones y observaciones considerando sus incertidumbres: con los mismos datos y procedimiento, un valor menor indica mejor acuerdo. En supernovas permitimos desplazar verticalmente las curvas para ajustar diferencias de calibración; el alcance de esa comparación depende de cómo tratamos los errores, cuestión que retomamos en la discusión.</w:t>
+        <w:t xml:space="preserve"> (chi cuadrado) resume las diferencias entre predicciones y observaciones considerando sus incertidumbres: con los mismos datos y procedimiento, un valor menor indica mejor acuerdo. En supernovas permitimos desplazar verticalmente las curvas para absorber diferencias de calibración; su alcance lo retomamos en la discusión.</w:t>
       </w:r>
     </w:p>
     <w:p>
@@ -890,19 +890,19 @@
         <w:rPr>
           <w:lang w:val="es-CL"/>
         </w:rPr>
-        <w:t xml:space="preserve">Con las ideas anteriores construimos una web con cuatro pestañas: Sistema Solar, Galaxia, Universo y Supernovas. Las últimas dos abordan la misma escala desde el modelo y desde las observaciones. El usuario cambia los parámetros y el programa vuelve a calcular, de modo que puede seguir las consecuencias de una decisión y no solo mirar un resultado fijo.</w:t>
-      </w:r>
-    </w:p>
-    <w:p>
-      <w:pPr>
-        <w:pStyle w:val="BodyText"/>
-        <w:spacing w:line="360" w:lineRule="auto"/>
-      </w:pPr>
-      <w:r>
-        <w:rPr>
-          <w:lang w:val="es-CL"/>
-        </w:rPr>
-        <w:t xml:space="preserve">Separamos los cálculos, las pruebas, los datos y la interfaz para poder revisar cada parte:</w:t>
+        <w:t xml:space="preserve">Con las ideas anteriores construimos una web con cuatro pestañas: Sistema Solar, Galaxia, Universo y Supernovas. Las últimas dos abordan la misma escala desde el modelo y desde las observaciones. El usuario cambia los parámetros y el programa vuelve a calcular.</w:t>
+      </w:r>
+    </w:p>
+    <w:p>
+      <w:pPr>
+        <w:pStyle w:val="BodyText"/>
+        <w:spacing w:line="360" w:lineRule="auto"/>
+      </w:pPr>
+      <w:r>
+        <w:rPr>
+          <w:lang w:val="es-CL"/>
+        </w:rPr>
+        <w:t xml:space="preserve">Separamos los cálculos, las pruebas, los datos y la interfaz para poder revisar cada parte. Es lo que aprendimos en Programación Avanzada: módulos pequeños, funciones que no guardan estado y una prueba por cada ley física.</w:t>
       </w:r>
     </w:p>
     <w:p>
@@ -1106,7 +1106,7 @@
         <w:rPr>
           <w:lang w:val="es-CL"/>
         </w:rPr>
-        <w:t xml:space="preserve">Para comprobarlo usamos las leyes de Kepler y soluciones cosmológicas conocidas para ciertos parámetros, y revisamos condiciones del código, como no modificar los datos de entrada. Cada prueba responde una pregunta concreta; aprobarlas nos da razones para confiar en esos cálculos dentro de las condiciones comprobadas.</w:t>
+        <w:t xml:space="preserve">Aquí entra una idea de Matemáticas Discretas. Si una propiedad se mantiene de un paso al siguiente, por inducción se mantiene después de cualquier número de pasos. Por eso las pruebas revisan el paso y unas pocas órbitas contra respuestas conocidas, como las leyes de Kepler o la edad de un universo con solución exacta, y no cada simulación completa. Aprobarlas nos da razones para confiar en esos cálculos dentro de las condiciones comprobadas.</w:t>
       </w:r>
     </w:p>
     <w:p>
@@ -1141,7 +1141,7 @@
       <w:r>
         <w:drawing>
           <wp:inline xmlns:a="http://schemas.openxmlformats.org/drawingml/2006/main" distT="0" distB="0" distL="0" distR="0">
-            <wp:extent cx="2520000" cy="1193939"/>
+            <wp:extent cx="2520000" cy="920626"/>
             <wp:effectExtent l="0" t="0" r="0" b="0"/>
             <wp:docPr id="1000" name="Figura 1000"/>
             <wp:cNvGraphicFramePr>
@@ -1163,7 +1163,7 @@
                   <pic:spPr>
                     <a:xfrm>
                       <a:off x="0" y="0"/>
-                      <a:ext cx="2520000" cy="1193939"/>
+                      <a:ext cx="2520000" cy="920626"/>
                     </a:xfrm>
                     <a:prstGeom prst="rect">
                       <a:avLst/>
@@ -1181,7 +1181,7 @@
       <w:r>
         <w:drawing>
           <wp:inline xmlns:a="http://schemas.openxmlformats.org/drawingml/2006/main" distT="0" distB="0" distL="0" distR="0">
-            <wp:extent cx="2520000" cy="1199710"/>
+            <wp:extent cx="2520000" cy="915248"/>
             <wp:effectExtent l="0" t="0" r="0" b="0"/>
             <wp:docPr id="1001" name="Figura 1001"/>
             <wp:cNvGraphicFramePr>
@@ -1203,7 +1203,7 @@
                   <pic:spPr>
                     <a:xfrm>
                       <a:off x="0" y="0"/>
-                      <a:ext cx="2520000" cy="1199710"/>
+                      <a:ext cx="2520000" cy="915248"/>
                     </a:xfrm>
                     <a:prstGeom prst="rect">
                       <a:avLst/>
@@ -1243,7 +1243,7 @@
       <w:r>
         <w:drawing>
           <wp:inline xmlns:a="http://schemas.openxmlformats.org/drawingml/2006/main" distT="0" distB="0" distL="0" distR="0">
-            <wp:extent cx="3671999" cy="1754855"/>
+            <wp:extent cx="3384000" cy="1099345"/>
             <wp:effectExtent l="0" t="0" r="0" b="0"/>
             <wp:docPr id="1002" name="Figura 1002"/>
             <wp:cNvGraphicFramePr>
@@ -1265,7 +1265,7 @@
                   <pic:spPr>
                     <a:xfrm>
                       <a:off x="0" y="0"/>
-                      <a:ext cx="3671999" cy="1754855"/>
+                      <a:ext cx="3384000" cy="1099345"/>
                     </a:xfrm>
                     <a:prstGeom prst="rect">
                       <a:avLst/>
@@ -1318,7 +1318,7 @@
       <w:r>
         <w:drawing>
           <wp:inline xmlns:a="http://schemas.openxmlformats.org/drawingml/2006/main" distT="0" distB="0" distL="0" distR="0">
-            <wp:extent cx="3671999" cy="1759983"/>
+            <wp:extent cx="3384000" cy="1298357"/>
             <wp:effectExtent l="0" t="0" r="0" b="0"/>
             <wp:docPr id="1003" name="Figura 1003"/>
             <wp:cNvGraphicFramePr>
@@ -1340,7 +1340,7 @@
                   <pic:spPr>
                     <a:xfrm>
                       <a:off x="0" y="0"/>
-                      <a:ext cx="3671999" cy="1759983"/>
+                      <a:ext cx="3384000" cy="1298357"/>
                     </a:xfrm>
                     <a:prstGeom prst="rect">
                       <a:avLst/>
@@ -1418,7 +1418,7 @@
       <w:r>
         <w:drawing>
           <wp:inline xmlns:a="http://schemas.openxmlformats.org/drawingml/2006/main" distT="0" distB="0" distL="0" distR="0">
-            <wp:extent cx="3671999" cy="1696680"/>
+            <wp:extent cx="3384000" cy="1304318"/>
             <wp:effectExtent l="0" t="0" r="0" b="0"/>
             <wp:docPr id="1004" name="Figura 1004"/>
             <wp:cNvGraphicFramePr>
@@ -1440,7 +1440,7 @@
                   <pic:spPr>
                     <a:xfrm>
                       <a:off x="0" y="0"/>
-                      <a:ext cx="3671999" cy="1696680"/>
+                      <a:ext cx="3384000" cy="1304318"/>
                     </a:xfrm>
                     <a:prstGeom prst="rect">
                       <a:avLst/>
@@ -1458,19 +1458,19 @@
         <w:pStyle w:val="Caption"/>
       </w:pPr>
       <w:r>
-        <w:t>Figura 4. Evolución del factor de escala en los cuatro escenarios. Con H₀ = 67,4 km/s/Mpc, el crítico, el abierto y el acelerado tienen edades de 9,67, 11,7 y 13,86 Gyr; el de recolapso termina invirtiendo su expansión.</w:t>
-      </w:r>
-    </w:p>
-    <w:p>
-      <w:pPr>
-        <w:pStyle w:val="BodyText"/>
-        <w:spacing w:line="360" w:lineRule="auto"/>
-      </w:pPr>
-      <w:r>
-        <w:rPr>
-          <w:lang w:val="es-CL"/>
-        </w:rPr>
-        <w:t xml:space="preserve">Con H₀ = 67,4 km/s/Mpc obtenemos edades de 9,67 Gyr para el caso crítico (Ωm = 1, ΩΛ = 0), 11,7 para el abierto (0,3; 0) y 13,86 para el acelerado (0,31; 0,69). Gyr significa mil millones de años. En el escenario de recolapso (5; 0), la mayor cantidad de materia detiene la expansión y luego la invierte. La edad del acelerado se acerca a los 13,8 Gyr inferidos por Planck (Planck Collaboration, 2020): nos interesa esa comparación precisamente porque el programa permite obtener edades distintas.</w:t>
+        <w:t>Figura 4. Evolución del factor de escala en los cuatro escenarios, con H₀ = 67,4 km/s/Mpc. Las curvas de solo materia llegan a a = 0 antes; el de recolapso termina invirtiendo su expansión.</w:t>
+      </w:r>
+    </w:p>
+    <w:p>
+      <w:pPr>
+        <w:pStyle w:val="BodyText"/>
+        <w:spacing w:line="360" w:lineRule="auto"/>
+      </w:pPr>
+      <w:r>
+        <w:rPr>
+          <w:lang w:val="es-CL"/>
+        </w:rPr>
+        <w:t xml:space="preserve">Con H₀ = 67,4 km/s/Mpc obtenemos edades de 9,67 Gyr para el caso crítico (Ωm = 1, ΩΛ = 0), 11,7 para el abierto (0,3; 0) y 13,86 para el acelerado (0,31; 0,69). Gyr significa mil millones de años. En el escenario de recolapso (5; 0), la mayor cantidad de materia detiene la expansión y luego la invierte. La edad del acelerado se acerca a los 13,8 Gyr inferidos por Planck (Planck Collaboration, 2020).</w:t>
       </w:r>
     </w:p>
     <w:p>
@@ -1505,7 +1505,7 @@
       <w:r>
         <w:drawing>
           <wp:inline xmlns:a="http://schemas.openxmlformats.org/drawingml/2006/main" distT="0" distB="0" distL="0" distR="0">
-            <wp:extent cx="2520000" cy="1174118"/>
+            <wp:extent cx="2520000" cy="931143"/>
             <wp:effectExtent l="0" t="0" r="0" b="0"/>
             <wp:docPr id="1005" name="Figura 1005"/>
             <wp:cNvGraphicFramePr>
@@ -1527,7 +1527,7 @@
                   <pic:spPr>
                     <a:xfrm>
                       <a:off x="0" y="0"/>
-                      <a:ext cx="2520000" cy="1174118"/>
+                      <a:ext cx="2520000" cy="931143"/>
                     </a:xfrm>
                     <a:prstGeom prst="rect">
                       <a:avLst/>
@@ -1545,7 +1545,7 @@
       <w:r>
         <w:drawing>
           <wp:inline xmlns:a="http://schemas.openxmlformats.org/drawingml/2006/main" distT="0" distB="0" distL="0" distR="0">
-            <wp:extent cx="2520000" cy="1173145"/>
+            <wp:extent cx="2520000" cy="917595"/>
             <wp:effectExtent l="0" t="0" r="0" b="0"/>
             <wp:docPr id="1006" name="Figura 1006"/>
             <wp:cNvGraphicFramePr>
@@ -1567,7 +1567,7 @@
                   <pic:spPr>
                     <a:xfrm>
                       <a:off x="0" y="0"/>
-                      <a:ext cx="2520000" cy="1173145"/>
+                      <a:ext cx="2520000" cy="917595"/>
                     </a:xfrm>
                     <a:prstGeom prst="rect">
                       <a:avLst/>
@@ -1602,18 +1602,6 @@
     </w:p>
     <w:p>
       <w:pPr>
-        <w:pStyle w:val="BodyText"/>
-        <w:spacing w:line="360" w:lineRule="auto"/>
-      </w:pPr>
-      <w:r>
-        <w:rPr>
-          <w:lang w:val="es-CL"/>
-        </w:rPr>
-        <w:t xml:space="preserve">Dejamos disponibles el código, la procedencia de los datos y las pruebas para que este recorrido pueda repetirse; además, las pruebas se ejecutan antes de publicar cambios en la web.</w:t>
-      </w:r>
-    </w:p>
-    <w:p>
-      <w:pPr>
         <w:pStyle w:val="Heading1"/>
         <w:spacing w:line="360" w:lineRule="auto"/>
         <w:keepNext/>
@@ -1673,6 +1661,18 @@
           <w:lang w:val="es-CL"/>
         </w:rPr>
         <w:t xml:space="preserve">, s. f.).</w:t>
+      </w:r>
+    </w:p>
+    <w:p>
+      <w:pPr>
+        <w:pStyle w:val="BodyText"/>
+        <w:spacing w:line="360" w:lineRule="auto"/>
+      </w:pPr>
+      <w:r>
+        <w:rPr>
+          <w:lang w:val="es-CL"/>
+        </w:rPr>
+        <w:t xml:space="preserve">También separamos dos errores. El del método, como el 57,6 % que gana Euler, viene de seguir la recta tangente en cada paso, la misma idea de Cálculo I. El de la máquina viene de que el computador redondea cada número en punto flotante, como vimos en Arquitectura de Computadores: en doble precisión guarda unas 16 cifras, así que ese error queda muy por debajo del primero. Cuando un resultado se ve raro, conviene saber cuál de los dos lo explica.</w:t>
       </w:r>
     </w:p>
     <w:p>

</xml_diff>

<commit_message>
Informe: figures re-exported with the final web labels
</commit_message>
<xml_diff>
--- a/informe/informe_borrador.docx
+++ b/informe/informe_borrador.docx
@@ -91,7 +91,7 @@
       <w:pPr>
         <w:pStyle w:val="CoverLinks"/>
       </w:pPr>
-      <w:hyperlink r:id="rIdInformeEstilo1" w:history="1">
+      <w:hyperlink r:id="rIdInformeEstilo1x" w:history="1">
         <w:r>
           <w:rPr>
             <w:u w:val="single"/>
@@ -104,7 +104,7 @@
       <w:pPr>
         <w:pStyle w:val="CoverLinks"/>
       </w:pPr>
-      <w:hyperlink r:id="rIdInformeEstilo2" w:history="1">
+      <w:hyperlink r:id="rIdInformeEstilo2x" w:history="1">
         <w:r>
           <w:rPr>
             <w:u w:val="single"/>
@@ -1141,7 +1141,7 @@
       <w:r>
         <w:drawing>
           <wp:inline xmlns:a="http://schemas.openxmlformats.org/drawingml/2006/main" distT="0" distB="0" distL="0" distR="0">
-            <wp:extent cx="2520000" cy="920626"/>
+            <wp:extent cx="2520000" cy="921077"/>
             <wp:effectExtent l="0" t="0" r="0" b="0"/>
             <wp:docPr id="1000" name="Figura 1000"/>
             <wp:cNvGraphicFramePr>
@@ -1163,7 +1163,7 @@
                   <pic:spPr>
                     <a:xfrm>
                       <a:off x="0" y="0"/>
-                      <a:ext cx="2520000" cy="920626"/>
+                      <a:ext cx="2520000" cy="921077"/>
                     </a:xfrm>
                     <a:prstGeom prst="rect">
                       <a:avLst/>
@@ -1181,7 +1181,7 @@
       <w:r>
         <w:drawing>
           <wp:inline xmlns:a="http://schemas.openxmlformats.org/drawingml/2006/main" distT="0" distB="0" distL="0" distR="0">
-            <wp:extent cx="2520000" cy="915248"/>
+            <wp:extent cx="2520000" cy="916587"/>
             <wp:effectExtent l="0" t="0" r="0" b="0"/>
             <wp:docPr id="1001" name="Figura 1001"/>
             <wp:cNvGraphicFramePr>
@@ -1203,7 +1203,7 @@
                   <pic:spPr>
                     <a:xfrm>
                       <a:off x="0" y="0"/>
-                      <a:ext cx="2520000" cy="915248"/>
+                      <a:ext cx="2520000" cy="916587"/>
                     </a:xfrm>
                     <a:prstGeom prst="rect">
                       <a:avLst/>
@@ -1243,7 +1243,7 @@
       <w:r>
         <w:drawing>
           <wp:inline xmlns:a="http://schemas.openxmlformats.org/drawingml/2006/main" distT="0" distB="0" distL="0" distR="0">
-            <wp:extent cx="3384000" cy="1099345"/>
+            <wp:extent cx="3384000" cy="1099882"/>
             <wp:effectExtent l="0" t="0" r="0" b="0"/>
             <wp:docPr id="1002" name="Figura 1002"/>
             <wp:cNvGraphicFramePr>
@@ -1265,7 +1265,7 @@
                   <pic:spPr>
                     <a:xfrm>
                       <a:off x="0" y="0"/>
-                      <a:ext cx="3384000" cy="1099345"/>
+                      <a:ext cx="3384000" cy="1099882"/>
                     </a:xfrm>
                     <a:prstGeom prst="rect">
                       <a:avLst/>
@@ -1318,7 +1318,7 @@
       <w:r>
         <w:drawing>
           <wp:inline xmlns:a="http://schemas.openxmlformats.org/drawingml/2006/main" distT="0" distB="0" distL="0" distR="0">
-            <wp:extent cx="3384000" cy="1298357"/>
+            <wp:extent cx="3384000" cy="1298992"/>
             <wp:effectExtent l="0" t="0" r="0" b="0"/>
             <wp:docPr id="1003" name="Figura 1003"/>
             <wp:cNvGraphicFramePr>
@@ -1340,7 +1340,7 @@
                   <pic:spPr>
                     <a:xfrm>
                       <a:off x="0" y="0"/>
-                      <a:ext cx="3384000" cy="1298357"/>
+                      <a:ext cx="3384000" cy="1298992"/>
                     </a:xfrm>
                     <a:prstGeom prst="rect">
                       <a:avLst/>
@@ -1418,7 +1418,7 @@
       <w:r>
         <w:drawing>
           <wp:inline xmlns:a="http://schemas.openxmlformats.org/drawingml/2006/main" distT="0" distB="0" distL="0" distR="0">
-            <wp:extent cx="3384000" cy="1304318"/>
+            <wp:extent cx="3384000" cy="1304951"/>
             <wp:effectExtent l="0" t="0" r="0" b="0"/>
             <wp:docPr id="1004" name="Figura 1004"/>
             <wp:cNvGraphicFramePr>
@@ -1440,7 +1440,7 @@
                   <pic:spPr>
                     <a:xfrm>
                       <a:off x="0" y="0"/>
-                      <a:ext cx="3384000" cy="1304318"/>
+                      <a:ext cx="3384000" cy="1304951"/>
                     </a:xfrm>
                     <a:prstGeom prst="rect">
                       <a:avLst/>
@@ -1505,7 +1505,7 @@
       <w:r>
         <w:drawing>
           <wp:inline xmlns:a="http://schemas.openxmlformats.org/drawingml/2006/main" distT="0" distB="0" distL="0" distR="0">
-            <wp:extent cx="2520000" cy="931143"/>
+            <wp:extent cx="2520000" cy="931599"/>
             <wp:effectExtent l="0" t="0" r="0" b="0"/>
             <wp:docPr id="1005" name="Figura 1005"/>
             <wp:cNvGraphicFramePr>
@@ -1527,7 +1527,7 @@
                   <pic:spPr>
                     <a:xfrm>
                       <a:off x="0" y="0"/>
-                      <a:ext cx="2520000" cy="931143"/>
+                      <a:ext cx="2520000" cy="931599"/>
                     </a:xfrm>
                     <a:prstGeom prst="rect">
                       <a:avLst/>
@@ -1545,7 +1545,7 @@
       <w:r>
         <w:drawing>
           <wp:inline xmlns:a="http://schemas.openxmlformats.org/drawingml/2006/main" distT="0" distB="0" distL="0" distR="0">
-            <wp:extent cx="2520000" cy="917595"/>
+            <wp:extent cx="2520000" cy="918044"/>
             <wp:effectExtent l="0" t="0" r="0" b="0"/>
             <wp:docPr id="1006" name="Figura 1006"/>
             <wp:cNvGraphicFramePr>
@@ -1567,7 +1567,7 @@
                   <pic:spPr>
                     <a:xfrm>
                       <a:off x="0" y="0"/>
-                      <a:ext cx="2520000" cy="917595"/>
+                      <a:ext cx="2520000" cy="918044"/>
                     </a:xfrm>
                     <a:prstGeom prst="rect">
                       <a:avLst/>

</xml_diff>

<commit_message>
Informe: AI-use statement approved, remove the review note
</commit_message>
<xml_diff>
--- a/informe/informe_borrador.docx
+++ b/informe/informe_borrador.docx
@@ -91,7 +91,7 @@
       <w:pPr>
         <w:pStyle w:val="CoverLinks"/>
       </w:pPr>
-      <w:hyperlink r:id="rIdInformeEstilo1x" w:history="1">
+      <w:hyperlink r:id="rIdInformeEstilo1" w:history="1">
         <w:r>
           <w:rPr>
             <w:u w:val="single"/>
@@ -104,7 +104,7 @@
       <w:pPr>
         <w:pStyle w:val="CoverLinks"/>
       </w:pPr>
-      <w:hyperlink r:id="rIdInformeEstilo2x" w:history="1">
+      <w:hyperlink r:id="rIdInformeEstilo2" w:history="1">
         <w:r>
           <w:rPr>
             <w:u w:val="single"/>
@@ -1972,14 +1972,7 @@
         <w:rPr>
           <w:lang w:val="es-CL"/>
         </w:rPr>
-        <w:t xml:space="preserve">Usamos asistentes de IA para apoyar el desarrollo, revisar fuentes y trabajar la redacción. José escribió el motor numérico y el Sistema Solar; las funciones de Universo, Supernovas y Galaxia se desarrollaron con asistencia de Claude (Anthropic) el 31 de octubre de 2026. También usamos un modelo GPT de OpenAI mediante OpenCode para revisar el nivel técnico y adaptar la redacción tomando como referencia textos previos de José. Las pruebas de física escritas antes de las implementaciones asistidas comprueban resultados concretos. La responsabilidad de revisar el código, las fuentes y lo que afirmamos en este informe es nuestra. </w:t>
-      </w:r>
-      <w:r>
-        <w:rPr>
-          <w:lang w:val="es-CL"/>
-          <w:i/>
-        </w:rPr>
-        <w:t xml:space="preserve">[José y Luis: confirmar la revisión personal de los resultados y las fuentes, y aprobar o ajustar esta declaración antes de entregar.]</w:t>
+        <w:t xml:space="preserve">Usamos asistentes de IA para apoyar el desarrollo, revisar fuentes y trabajar la redacción. José escribió el motor numérico y el Sistema Solar; las funciones de Universo, Supernovas y Galaxia se desarrollaron con asistencia de Claude (Anthropic) el 31 de octubre de 2026. También usamos un modelo GPT de OpenAI mediante OpenCode para revisar el nivel técnico y adaptar la redacción tomando como referencia textos previos de José. Las pruebas de física escritas antes de las implementaciones asistidas comprueban resultados concretos. La responsabilidad de revisar el código, las fuentes y lo que afirmamos en este informe es nuestra.</w:t>
       </w:r>
     </w:p>
     <w:p>

</xml_diff>

<commit_message>
Informe: collaborative-learning paragraph in 5.1
</commit_message>
<xml_diff>
--- a/informe/informe_borrador.docx
+++ b/informe/informe_borrador.docx
@@ -91,7 +91,7 @@
       <w:pPr>
         <w:pStyle w:val="CoverLinks"/>
       </w:pPr>
-      <w:hyperlink r:id="rIdInformeEstilo1" w:history="1">
+      <w:hyperlink r:id="rIdInformeEstilo1x" w:history="1">
         <w:r>
           <w:rPr>
             <w:u w:val="single"/>
@@ -104,7 +104,7 @@
       <w:pPr>
         <w:pStyle w:val="CoverLinks"/>
       </w:pPr>
-      <w:hyperlink r:id="rIdInformeEstilo2" w:history="1">
+      <w:hyperlink r:id="rIdInformeEstilo2x" w:history="1">
         <w:r>
           <w:rPr>
             <w:u w:val="single"/>
@@ -1928,14 +1928,7 @@
         <w:rPr>
           <w:lang w:val="es-CL"/>
         </w:rPr>
-        <w:t xml:space="preserve"> </w:t>
-      </w:r>
-      <w:r>
-        <w:rPr>
-          <w:lang w:val="es-CL"/>
-          <w:i/>
-        </w:rPr>
-        <w:t xml:space="preserve">[Luis: 3–4 líneas propias sobre cómo se repartieron el trabajo (código y numérica frente a astronomía, datos y redacción) y qué aprendió cada uno del área del otro. Luis las dictará.]</w:t>
+        <w:t xml:space="preserve"> Nos repartimos el trabajo según lo que cada uno podía aportar: José el código, las pruebas y la parte numérica; Luis la investigación, las fuentes y la redacción. Para Luis, lo más interesante fue analizar el código e intentar entender la física que hay detrás mientras el informe avanzaba poco a poco. La fundamentación teórica es la base de cualquier proyecto científico y computacional, y esa parte sostuvo el resto del trabajo.</w:t>
       </w:r>
     </w:p>
     <w:p>

</xml_diff>

<commit_message>
Informe: full author names on the cover
</commit_message>
<xml_diff>
--- a/informe/informe_borrador.docx
+++ b/informe/informe_borrador.docx
@@ -23,7 +23,7 @@
         <w:rPr>
           <w:lang w:val="es-CL"/>
         </w:rPr>
-        <w:t xml:space="preserve">Erazo, L., Garrillo, J.</w:t>
+        <w:t xml:space="preserve">José Garrillo y Luis Erazo</w:t>
       </w:r>
     </w:p>
     <w:p>
@@ -91,7 +91,7 @@
       <w:pPr>
         <w:pStyle w:val="CoverLinks"/>
       </w:pPr>
-      <w:hyperlink r:id="rIdInformeEstilo1x" w:history="1">
+      <w:hyperlink r:id="rIdInformeEstilo1" w:history="1">
         <w:r>
           <w:rPr>
             <w:u w:val="single"/>
@@ -104,7 +104,7 @@
       <w:pPr>
         <w:pStyle w:val="CoverLinks"/>
       </w:pPr>
-      <w:hyperlink r:id="rIdInformeEstilo2x" w:history="1">
+      <w:hyperlink r:id="rIdInformeEstilo2" w:history="1">
         <w:r>
           <w:rPr>
             <w:u w:val="single"/>

</xml_diff>

<commit_message>
Informe: Arial headings and Courier New code block in the final PDF
</commit_message>
<xml_diff>
--- a/informe/informe_borrador.docx
+++ b/informe/informe_borrador.docx
@@ -91,7 +91,7 @@
       <w:pPr>
         <w:pStyle w:val="CoverLinks"/>
       </w:pPr>
-      <w:hyperlink r:id="rIdInformeEstilo1x" w:history="1">
+      <w:hyperlink r:id="rIdInformeEstilo1" w:history="1">
         <w:r>
           <w:rPr>
             <w:u w:val="single"/>
@@ -104,7 +104,7 @@
       <w:pPr>
         <w:pStyle w:val="CoverLinks"/>
       </w:pPr>
-      <w:hyperlink r:id="rIdInformeEstilo2x" w:history="1">
+      <w:hyperlink r:id="rIdInformeEstilo2" w:history="1">
         <w:r>
           <w:rPr>
             <w:u w:val="single"/>
@@ -3798,7 +3798,7 @@
     <w:name w:val="Source Text"/>
     <w:qFormat/>
     <w:rPr>
-      <w:rFonts w:ascii="Liberation Mono" w:hAnsi="Liberation Mono" w:eastAsia="Noto Sans Mono CJK SC" w:cs="Liberation Mono"/>
+      <w:rFonts w:ascii="Courier New" w:hAnsi="Courier New" w:eastAsia="Noto Sans Mono CJK SC" w:cs="Courier New"/>
     </w:rPr>
   </w:style>
   <w:style w:type="paragraph" w:styleId="HorizontalLine">
@@ -3885,7 +3885,7 @@
       <w:spacing w:before="240" w:after="283"/>
     </w:pPr>
     <w:rPr>
-      <w:rFonts w:ascii="Liberation Sans" w:hAnsi="Liberation Sans"/>
+      <w:rFonts w:ascii="Arial" w:hAnsi="Arial"/>
       <w:sz w:val="28"/>
       <w:szCs w:val="28"/>
     </w:rPr>

</xml_diff>